<commit_message>
inclusão de pesquisa sobre stalking bancário e primeiro artigo da série de oito da campanha
</commit_message>
<xml_diff>
--- a/documentos/25 02 2026 artigo res 4966.docx
+++ b/documentos/25 02 2026 artigo res 4966.docx
@@ -40,7 +40,7 @@
     <w:p>
       <w:r>
         <w:pict w14:anchorId="4B979995">
-          <v:rect id="_x0000_i1037" style="width:0;height:1.5pt" o:hralign="center" o:hrstd="t" o:hrnoshade="t" o:hr="t" fillcolor="gray" stroked="f"/>
+          <v:rect id="_x0000_i1025" style="width:0;height:1.5pt" o:hralign="center" o:hrstd="t" o:hrnoshade="t" o:hr="t" fillcolor="gray" stroked="f"/>
         </w:pict>
       </w:r>
     </w:p>
@@ -361,7 +361,7 @@
     <w:p>
       <w:r>
         <w:pict w14:anchorId="11EBBC87">
-          <v:rect id="_x0000_i1038" style="width:0;height:1.5pt" o:hralign="center" o:hrstd="t" o:hrnoshade="t" o:hr="t" fillcolor="gray" stroked="f"/>
+          <v:rect id="_x0000_i1026" style="width:0;height:1.5pt" o:hralign="center" o:hrstd="t" o:hrnoshade="t" o:hr="t" fillcolor="gray" stroked="f"/>
         </w:pict>
       </w:r>
     </w:p>
@@ -1182,6 +1182,7 @@
   <w:style w:type="character" w:default="1" w:styleId="Fontepargpadro">
     <w:name w:val="Default Paragraph Font"/>
     <w:uiPriority w:val="1"/>
+    <w:semiHidden/>
     <w:unhideWhenUsed/>
   </w:style>
   <w:style w:type="table" w:default="1" w:styleId="Tabelanormal">

</xml_diff>

<commit_message>
Inclusão do novo artigo sobre Res 4966
</commit_message>
<xml_diff>
--- a/documentos/25 02 2026 artigo res 4966.docx
+++ b/documentos/25 02 2026 artigo res 4966.docx
@@ -445,6 +445,635 @@
       </w:r>
       <w:r>
         <w:t>, ou prefere que eu elabore uma sequência de posts para redes sociais baseada neste artigo?</w:t>
+      </w:r>
+    </w:p>
+    <w:p>
+      <w:r>
+        <w:br w:type="page"/>
+      </w:r>
+    </w:p>
+    <w:p>
+      <w:r>
+        <w:lastRenderedPageBreak/>
+        <w:t>Esta Nota Técnica foi elaborada com o rigor científico e a diligência profissional exigidos para fundamentar a atuação pericial de elite. O foco reside na transição do modelo contábil de instituições financeiras e na imperatividade da transparência algorítmica.</w:t>
+      </w:r>
+    </w:p>
+    <w:p>
+      <w:r>
+        <w:pict w14:anchorId="115CE0A7">
+          <v:rect id="_x0000_i1039" style="width:0;height:1.5pt" o:hralign="center" o:hrstd="t" o:hrnoshade="t" o:hr="t" fillcolor="gray" stroked="f"/>
+        </w:pict>
+      </w:r>
+    </w:p>
+    <w:p>
+      <w:pPr>
+        <w:rPr>
+          <w:b/>
+          <w:bCs/>
+        </w:rPr>
+      </w:pPr>
+      <w:r>
+        <w:rPr>
+          <w:b/>
+          <w:bCs/>
+        </w:rPr>
+        <w:t>Nota Técnica: Diligência e Responsabilidade na Auditoria da Resolução CMN 4.966/21</w:t>
+      </w:r>
+    </w:p>
+    <w:p>
+      <w:r>
+        <w:rPr>
+          <w:b/>
+          <w:bCs/>
+        </w:rPr>
+        <w:t>Assunto:</w:t>
+      </w:r>
+      <w:r>
+        <w:t xml:space="preserve"> Fundamentação legal e normativa para a auditabilidade de modelos de perda esperada (ECL) e governança de dados no setor bancário.</w:t>
+      </w:r>
+    </w:p>
+    <w:p>
+      <w:pPr>
+        <w:rPr>
+          <w:b/>
+          <w:bCs/>
+        </w:rPr>
+      </w:pPr>
+      <w:r>
+        <w:rPr>
+          <w:b/>
+          <w:bCs/>
+        </w:rPr>
+        <w:t>1. O Amparo Normativo: BACEN e o Padrão IFRS 9</w:t>
+      </w:r>
+    </w:p>
+    <w:p>
+      <w:r>
+        <w:t xml:space="preserve">A </w:t>
+      </w:r>
+      <w:r>
+        <w:rPr>
+          <w:b/>
+          <w:bCs/>
+        </w:rPr>
+        <w:t>Resolução CMN nº 4.966/2021</w:t>
+      </w:r>
+      <w:r>
+        <w:t xml:space="preserve"> não é uma norma isolada, mas a convergência do Brasil ao padrão internacional </w:t>
+      </w:r>
+      <w:r>
+        <w:rPr>
+          <w:b/>
+          <w:bCs/>
+        </w:rPr>
+        <w:t>IFRS 9</w:t>
+      </w:r>
+      <w:r>
+        <w:t xml:space="preserve">. A diligência técnica exige que se compreenda que a norma altera o gatilho da provisão: sai a "perda incorrida" e entra a </w:t>
+      </w:r>
+      <w:r>
+        <w:rPr>
+          <w:b/>
+          <w:bCs/>
+        </w:rPr>
+        <w:t xml:space="preserve">Perda Esperada (ECL – </w:t>
+      </w:r>
+      <w:proofErr w:type="spellStart"/>
+      <w:r>
+        <w:rPr>
+          <w:b/>
+          <w:bCs/>
+        </w:rPr>
+        <w:t>Expected</w:t>
+      </w:r>
+      <w:proofErr w:type="spellEnd"/>
+      <w:r>
+        <w:rPr>
+          <w:b/>
+          <w:bCs/>
+        </w:rPr>
+        <w:t xml:space="preserve"> </w:t>
+      </w:r>
+      <w:proofErr w:type="spellStart"/>
+      <w:r>
+        <w:rPr>
+          <w:b/>
+          <w:bCs/>
+        </w:rPr>
+        <w:t>Credit</w:t>
+      </w:r>
+      <w:proofErr w:type="spellEnd"/>
+      <w:r>
+        <w:rPr>
+          <w:b/>
+          <w:bCs/>
+        </w:rPr>
+        <w:t xml:space="preserve"> </w:t>
+      </w:r>
+      <w:proofErr w:type="spellStart"/>
+      <w:r>
+        <w:rPr>
+          <w:b/>
+          <w:bCs/>
+        </w:rPr>
+        <w:t>Loss</w:t>
+      </w:r>
+      <w:proofErr w:type="spellEnd"/>
+      <w:r>
+        <w:rPr>
+          <w:b/>
+          <w:bCs/>
+        </w:rPr>
+        <w:t>)</w:t>
+      </w:r>
+      <w:r>
+        <w:t>.</w:t>
+      </w:r>
+    </w:p>
+    <w:p>
+      <w:pPr>
+        <w:numPr>
+          <w:ilvl w:val="0"/>
+          <w:numId w:val="2"/>
+        </w:numPr>
+      </w:pPr>
+      <w:r>
+        <w:rPr>
+          <w:b/>
+          <w:bCs/>
+        </w:rPr>
+        <w:t>Auditabilidade Compulsória (Art. 3º e 4º):</w:t>
+      </w:r>
+      <w:r>
+        <w:t xml:space="preserve"> A norma estabelece que as instituições financeiras devem manter documentação detalhada das metodologias, modelos e pressupostos utilizados. A inexistência de rastreabilidade ou a recusa em apresentar a lógica do modelo constitui descumprimento normativo perante o Banco Central.</w:t>
+      </w:r>
+    </w:p>
+    <w:p>
+      <w:pPr>
+        <w:numPr>
+          <w:ilvl w:val="0"/>
+          <w:numId w:val="2"/>
+        </w:numPr>
+      </w:pPr>
+      <w:r>
+        <w:rPr>
+          <w:b/>
+          <w:bCs/>
+        </w:rPr>
+        <w:t>Gestão de Riscos (Resolução CMN nº 4.557/17):</w:t>
+      </w:r>
+      <w:r>
+        <w:t xml:space="preserve"> Esta resolução obriga as instituições a terem estruturas de gerenciamento de riscos robustas. A Resolução 4.966/21 herda essa obrigatoriedade, exigindo que o </w:t>
+      </w:r>
+      <w:r>
+        <w:rPr>
+          <w:b/>
+          <w:bCs/>
+        </w:rPr>
+        <w:t>modelo de risco</w:t>
+      </w:r>
+      <w:r>
+        <w:t xml:space="preserve"> (o algoritmo) seja passível de validação independente.</w:t>
+      </w:r>
+    </w:p>
+    <w:p>
+      <w:pPr>
+        <w:rPr>
+          <w:b/>
+          <w:bCs/>
+        </w:rPr>
+      </w:pPr>
+      <w:r>
+        <w:rPr>
+          <w:b/>
+          <w:bCs/>
+        </w:rPr>
+        <w:t>2. A Premissa da "Caixa-Preta" vs. Dever de Transparência</w:t>
+      </w:r>
+    </w:p>
+    <w:p>
+      <w:r>
+        <w:t xml:space="preserve">A realidade técnica é que o cálculo da Perda Esperada depende de três variáveis fundamentais que </w:t>
+      </w:r>
+      <w:r>
+        <w:rPr>
+          <w:b/>
+          <w:bCs/>
+        </w:rPr>
+        <w:t>devem</w:t>
+      </w:r>
+      <w:r>
+        <w:t xml:space="preserve"> ser auditadas:</w:t>
+      </w:r>
+    </w:p>
+    <w:p>
+      <w:pPr>
+        <w:numPr>
+          <w:ilvl w:val="0"/>
+          <w:numId w:val="3"/>
+        </w:numPr>
+      </w:pPr>
+      <w:r>
+        <w:rPr>
+          <w:b/>
+          <w:bCs/>
+        </w:rPr>
+        <w:t>PD (</w:t>
+      </w:r>
+      <w:proofErr w:type="spellStart"/>
+      <w:r>
+        <w:rPr>
+          <w:b/>
+          <w:bCs/>
+        </w:rPr>
+        <w:t>Probability</w:t>
+      </w:r>
+      <w:proofErr w:type="spellEnd"/>
+      <w:r>
+        <w:rPr>
+          <w:b/>
+          <w:bCs/>
+        </w:rPr>
+        <w:t xml:space="preserve"> of Default):</w:t>
+      </w:r>
+      <w:r>
+        <w:t xml:space="preserve"> A probabilidade de o cliente não pagar.</w:t>
+      </w:r>
+    </w:p>
+    <w:p>
+      <w:pPr>
+        <w:numPr>
+          <w:ilvl w:val="0"/>
+          <w:numId w:val="3"/>
+        </w:numPr>
+      </w:pPr>
+      <w:r>
+        <w:rPr>
+          <w:b/>
+          <w:bCs/>
+        </w:rPr>
+        <w:t>LGD (</w:t>
+      </w:r>
+      <w:proofErr w:type="spellStart"/>
+      <w:r>
+        <w:rPr>
+          <w:b/>
+          <w:bCs/>
+        </w:rPr>
+        <w:t>Loss</w:t>
+      </w:r>
+      <w:proofErr w:type="spellEnd"/>
+      <w:r>
+        <w:rPr>
+          <w:b/>
+          <w:bCs/>
+        </w:rPr>
+        <w:t xml:space="preserve"> </w:t>
+      </w:r>
+      <w:proofErr w:type="spellStart"/>
+      <w:r>
+        <w:rPr>
+          <w:b/>
+          <w:bCs/>
+        </w:rPr>
+        <w:t>Given</w:t>
+      </w:r>
+      <w:proofErr w:type="spellEnd"/>
+      <w:r>
+        <w:rPr>
+          <w:b/>
+          <w:bCs/>
+        </w:rPr>
+        <w:t xml:space="preserve"> Default):</w:t>
+      </w:r>
+      <w:r>
+        <w:t xml:space="preserve"> O quanto o banco efetivamente perde se o cliente falhar.</w:t>
+      </w:r>
+    </w:p>
+    <w:p>
+      <w:pPr>
+        <w:numPr>
+          <w:ilvl w:val="0"/>
+          <w:numId w:val="3"/>
+        </w:numPr>
+      </w:pPr>
+      <w:r>
+        <w:rPr>
+          <w:b/>
+          <w:bCs/>
+        </w:rPr>
+        <w:t>EAD (</w:t>
+      </w:r>
+      <w:proofErr w:type="spellStart"/>
+      <w:r>
+        <w:rPr>
+          <w:b/>
+          <w:bCs/>
+        </w:rPr>
+        <w:t>Exposure</w:t>
+      </w:r>
+      <w:proofErr w:type="spellEnd"/>
+      <w:r>
+        <w:rPr>
+          <w:b/>
+          <w:bCs/>
+        </w:rPr>
+        <w:t xml:space="preserve"> at Default):</w:t>
+      </w:r>
+      <w:r>
+        <w:t xml:space="preserve"> O valor da exposição no momento da falha.</w:t>
+      </w:r>
+    </w:p>
+    <w:p>
+      <w:r>
+        <w:rPr>
+          <w:b/>
+          <w:bCs/>
+        </w:rPr>
+        <w:t>A Verdade Técnica:</w:t>
+      </w:r>
+      <w:r>
+        <w:t xml:space="preserve"> Se uma instituição financeira não demonstra a </w:t>
+      </w:r>
+      <w:r>
+        <w:rPr>
+          <w:b/>
+          <w:bCs/>
+        </w:rPr>
+        <w:t xml:space="preserve">Linhagem de Dados (Data </w:t>
+      </w:r>
+      <w:proofErr w:type="spellStart"/>
+      <w:r>
+        <w:rPr>
+          <w:b/>
+          <w:bCs/>
+        </w:rPr>
+        <w:t>Lineage</w:t>
+      </w:r>
+      <w:proofErr w:type="spellEnd"/>
+      <w:r>
+        <w:rPr>
+          <w:b/>
+          <w:bCs/>
+        </w:rPr>
+        <w:t>)</w:t>
+      </w:r>
+      <w:r>
+        <w:t xml:space="preserve"> — ou seja, de onde veio a informação e como ela foi processada pelo algoritmo — ela fere o princípio da fidedignidade da informação financeira.</w:t>
+      </w:r>
+    </w:p>
+    <w:p>
+      <w:pPr>
+        <w:rPr>
+          <w:b/>
+          <w:bCs/>
+        </w:rPr>
+      </w:pPr>
+      <w:r>
+        <w:rPr>
+          <w:b/>
+          <w:bCs/>
+        </w:rPr>
+        <w:lastRenderedPageBreak/>
+        <w:t>3. Jurisprudência e a Prova Pericial em TI</w:t>
+      </w:r>
+    </w:p>
+    <w:p>
+      <w:r>
+        <w:t xml:space="preserve">Embora a Resolução 4.966/21 seja recente (com implementação plena em 2025), a jurisprudência brasileira consolidada sobre </w:t>
+      </w:r>
+      <w:r>
+        <w:rPr>
+          <w:b/>
+          <w:bCs/>
+        </w:rPr>
+        <w:t>Perícia em Sistemas</w:t>
+      </w:r>
+      <w:r>
+        <w:t xml:space="preserve"> e </w:t>
+      </w:r>
+      <w:r>
+        <w:rPr>
+          <w:b/>
+          <w:bCs/>
+        </w:rPr>
+        <w:t>Direito Bancário</w:t>
+      </w:r>
+      <w:r>
+        <w:t xml:space="preserve"> já aponta o caminho da responsabilidade:</w:t>
+      </w:r>
+    </w:p>
+    <w:p>
+      <w:pPr>
+        <w:numPr>
+          <w:ilvl w:val="0"/>
+          <w:numId w:val="4"/>
+        </w:numPr>
+      </w:pPr>
+      <w:r>
+        <w:rPr>
+          <w:b/>
+          <w:bCs/>
+        </w:rPr>
+        <w:t>Inversão do Ônus da Prova (CDC, Art. 6º, VIII):</w:t>
+      </w:r>
+      <w:r>
+        <w:t xml:space="preserve"> Em relações de consumo bancárias, cabe à instituição provar a retidão dos seus sistemas. Se o banco alega que o provisionamento e os encargos seguem a 4.966, ele deve provar a integridade do algoritmo sob pena de presunção de erro material.</w:t>
+      </w:r>
+    </w:p>
+    <w:p>
+      <w:pPr>
+        <w:numPr>
+          <w:ilvl w:val="0"/>
+          <w:numId w:val="4"/>
+        </w:numPr>
+      </w:pPr>
+      <w:r>
+        <w:rPr>
+          <w:b/>
+          <w:bCs/>
+        </w:rPr>
+        <w:t>Poder Instrutório do Juiz (CPC, Art. 370):</w:t>
+      </w:r>
+      <w:r>
+        <w:t xml:space="preserve"> O juiz tem o dever de determinar as provas necessárias. Quando um cálculo é "sistêmico", a perícia contábil comum é insuficiente. A jurisprudência tem admitido a necessidade de </w:t>
+      </w:r>
+      <w:r>
+        <w:rPr>
+          <w:b/>
+          <w:bCs/>
+        </w:rPr>
+        <w:t>Perito Especialista em TI/Sistemas</w:t>
+      </w:r>
+      <w:r>
+        <w:t xml:space="preserve"> quando o ponto controvertido reside na "lógica interna do software".</w:t>
+      </w:r>
+    </w:p>
+    <w:p>
+      <w:pPr>
+        <w:rPr>
+          <w:b/>
+          <w:bCs/>
+        </w:rPr>
+      </w:pPr>
+      <w:r>
+        <w:rPr>
+          <w:b/>
+          <w:bCs/>
+        </w:rPr>
+        <w:t>4. Como a Auditoria deve ser Realizada (Metodologia Diligente)</w:t>
+      </w:r>
+    </w:p>
+    <w:p>
+      <w:r>
+        <w:t>Para que a auditoria seja responsável e inquestionável, ela deve seguir estes passos:</w:t>
+      </w:r>
+    </w:p>
+    <w:p>
+      <w:pPr>
+        <w:numPr>
+          <w:ilvl w:val="0"/>
+          <w:numId w:val="5"/>
+        </w:numPr>
+      </w:pPr>
+      <w:r>
+        <w:rPr>
+          <w:b/>
+          <w:bCs/>
+        </w:rPr>
+        <w:t xml:space="preserve">Auditoria de </w:t>
+      </w:r>
+      <w:proofErr w:type="spellStart"/>
+      <w:r>
+        <w:rPr>
+          <w:b/>
+          <w:bCs/>
+        </w:rPr>
+        <w:t>Staging</w:t>
+      </w:r>
+      <w:proofErr w:type="spellEnd"/>
+      <w:r>
+        <w:rPr>
+          <w:b/>
+          <w:bCs/>
+        </w:rPr>
+        <w:t xml:space="preserve"> (SICR):</w:t>
+      </w:r>
+      <w:r>
+        <w:t xml:space="preserve"> Verificar se os critérios de "Aumento Significativo de Risco" (SICR) são objetivos ou se o banco migra ativos para o Estágio 2 de forma arbitrária para inflar provisões.</w:t>
+      </w:r>
+    </w:p>
+    <w:p>
+      <w:pPr>
+        <w:numPr>
+          <w:ilvl w:val="0"/>
+          <w:numId w:val="5"/>
+        </w:numPr>
+      </w:pPr>
+      <w:r>
+        <w:rPr>
+          <w:b/>
+          <w:bCs/>
+        </w:rPr>
+        <w:t>Validação de Management Overlays:</w:t>
+      </w:r>
+      <w:r>
+        <w:t xml:space="preserve"> Identificar se ajustes manuais de diretoria (overlays) foram aplicados para distorcer o modelo estatístico puro.</w:t>
+      </w:r>
+    </w:p>
+    <w:p>
+      <w:pPr>
+        <w:numPr>
+          <w:ilvl w:val="0"/>
+          <w:numId w:val="5"/>
+        </w:numPr>
+      </w:pPr>
+      <w:r>
+        <w:rPr>
+          <w:b/>
+          <w:bCs/>
+        </w:rPr>
+        <w:t xml:space="preserve">Conferência de Dados </w:t>
+      </w:r>
+      <w:proofErr w:type="spellStart"/>
+      <w:r>
+        <w:rPr>
+          <w:b/>
+          <w:bCs/>
+        </w:rPr>
+        <w:t>Forward-looking</w:t>
+      </w:r>
+      <w:proofErr w:type="spellEnd"/>
+      <w:r>
+        <w:rPr>
+          <w:b/>
+          <w:bCs/>
+        </w:rPr>
+        <w:t>:</w:t>
+      </w:r>
+      <w:r>
+        <w:t xml:space="preserve"> Auditar se as projeções macroeconômicas (PIB, desemprego) usadas pelo banco são baseadas em fontes oficiais ou em cenários enviesados.</w:t>
+      </w:r>
+    </w:p>
+    <w:p>
+      <w:pPr>
+        <w:rPr>
+          <w:b/>
+          <w:bCs/>
+        </w:rPr>
+      </w:pPr>
+      <w:r>
+        <w:rPr>
+          <w:b/>
+          <w:bCs/>
+        </w:rPr>
+        <w:t>5. Conclusão Responsável</w:t>
+      </w:r>
+    </w:p>
+    <w:p>
+      <w:r>
+        <w:t xml:space="preserve">Não há, até o presente momento, jurisprudência específica que cite nominalmente "anulação de cálculo por erro na Resolução 4.966" devido à sua contemporaneidade. No entanto, o </w:t>
+      </w:r>
+      <w:r>
+        <w:rPr>
+          <w:b/>
+          <w:bCs/>
+        </w:rPr>
+        <w:t>dever de transparência e a auditabilidade de sistemas críticos</w:t>
+      </w:r>
+      <w:r>
+        <w:t xml:space="preserve"> são pilares consolidados no ordenamento jurídico brasileiro.</w:t>
+      </w:r>
+    </w:p>
+    <w:p>
+      <w:r>
+        <w:t>O perito que ignora a engenharia de dados e foca apenas no saldo final está sendo negligente com a nova realidade normativa. A diligência exige que a "Caixa-Preta" seja aberta para garantir que o direito do jurisdicionado não seja suprimido por uma opacidade algorítmica.</w:t>
+      </w:r>
+    </w:p>
+    <w:p>
+      <w:r>
+        <w:lastRenderedPageBreak/>
+        <w:pict w14:anchorId="33232622">
+          <v:rect id="_x0000_i1040" style="width:0;height:1.5pt" o:hralign="center" o:hrstd="t" o:hrnoshade="t" o:hr="t" fillcolor="gray" stroked="f"/>
+        </w:pict>
+      </w:r>
+    </w:p>
+    <w:p>
+      <w:r>
+        <w:rPr>
+          <w:b/>
+          <w:bCs/>
+        </w:rPr>
+        <w:t>Dr. Lincoln Sposito</w:t>
+      </w:r>
+    </w:p>
+    <w:p>
+      <w:r>
+        <w:rPr>
+          <w:i/>
+          <w:iCs/>
+        </w:rPr>
+        <w:t>Doutor em Administração | Analista de Sistemas | Perito Judicial</w:t>
       </w:r>
     </w:p>
     <w:p/>
@@ -461,6 +1090,417 @@
 <file path=word/numbering.xml><?xml version="1.0" encoding="utf-8"?>
 <w:numbering xmlns:wpc="http://schemas.microsoft.com/office/word/2010/wordprocessingCanvas" xmlns:cx="http://schemas.microsoft.com/office/drawing/2014/chartex" xmlns:cx1="http://schemas.microsoft.com/office/drawing/2015/9/8/chartex" xmlns:cx2="http://schemas.microsoft.com/office/drawing/2015/10/21/chartex" xmlns:cx3="http://schemas.microsoft.com/office/drawing/2016/5/9/chartex" xmlns:cx4="http://schemas.microsoft.com/office/drawing/2016/5/10/chartex" xmlns:cx5="http://schemas.microsoft.com/office/drawing/2016/5/11/chartex" xmlns:cx6="http://schemas.microsoft.com/office/drawing/2016/5/12/chartex" xmlns:cx7="http://schemas.microsoft.com/office/drawing/2016/5/13/chartex" xmlns:cx8="http://schemas.microsoft.com/office/drawing/2016/5/14/chartex" xmlns:mc="http://schemas.openxmlformats.org/markup-compatibility/2006" xmlns:aink="http://schemas.microsoft.com/office/drawing/2016/ink" xmlns:am3d="http://schemas.microsoft.com/office/drawing/2017/model3d" xmlns:o="urn:schemas-microsoft-com:office:office" xmlns:oel="http://schemas.microsoft.com/office/2019/extlst" xmlns:r="http://schemas.openxmlformats.org/officeDocument/2006/relationships" xmlns:m="http://schemas.openxmlformats.org/officeDocument/2006/math" xmlns:v="urn:schemas-microsoft-com:vml" xmlns:wp14="http://schemas.microsoft.com/office/word/2010/wordprocessingDrawing" xmlns:wp="http://schemas.openxmlformats.org/drawingml/2006/wordprocessingDrawing" xmlns:w10="urn:schemas-microsoft-com:office:word" xmlns:w="http://schemas.openxmlformats.org/wordprocessingml/2006/main" xmlns:w14="http://schemas.microsoft.com/office/word/2010/wordml" xmlns:w15="http://schemas.microsoft.com/office/word/2012/wordml" xmlns:w16cex="http://schemas.microsoft.com/office/word/2018/wordml/cex" xmlns:w16cid="http://schemas.microsoft.com/office/word/2016/wordml/cid" xmlns:w16="http://schemas.microsoft.com/office/word/2018/wordml" xmlns:w16du="http://schemas.microsoft.com/office/word/2023/wordml/word16du" xmlns:w16sdtdh="http://schemas.microsoft.com/office/word/2020/wordml/sdtdatahash" xmlns:w16sdtfl="http://schemas.microsoft.com/office/word/2024/wordml/sdtformatlock" xmlns:w16se="http://schemas.microsoft.com/office/word/2015/wordml/symex" xmlns:wpg="http://schemas.microsoft.com/office/word/2010/wordprocessingGroup" xmlns:wpi="http://schemas.microsoft.com/office/word/2010/wordprocessingInk" xmlns:wne="http://schemas.microsoft.com/office/word/2006/wordml" xmlns:wps="http://schemas.microsoft.com/office/word/2010/wordprocessingShape" mc:Ignorable="w14 w15 w16se w16cid w16 w16cex w16sdtdh w16sdtfl w16du wp14">
   <w:abstractNum w:abstractNumId="0" w15:restartNumberingAfterBreak="0">
+    <w:nsid w:val="41453A13"/>
+    <w:multiLevelType w:val="multilevel"/>
+    <w:tmpl w:val="6ADC0C90"/>
+    <w:lvl w:ilvl="0">
+      <w:start w:val="1"/>
+      <w:numFmt w:val="bullet"/>
+      <w:lvlText w:val=""/>
+      <w:lvlJc w:val="left"/>
+      <w:pPr>
+        <w:tabs>
+          <w:tab w:val="num" w:pos="720"/>
+        </w:tabs>
+        <w:ind w:left="720" w:hanging="360"/>
+      </w:pPr>
+      <w:rPr>
+        <w:rFonts w:ascii="Symbol" w:hAnsi="Symbol" w:hint="default"/>
+        <w:sz w:val="20"/>
+      </w:rPr>
+    </w:lvl>
+    <w:lvl w:ilvl="1" w:tentative="1">
+      <w:start w:val="1"/>
+      <w:numFmt w:val="bullet"/>
+      <w:lvlText w:val="o"/>
+      <w:lvlJc w:val="left"/>
+      <w:pPr>
+        <w:tabs>
+          <w:tab w:val="num" w:pos="1440"/>
+        </w:tabs>
+        <w:ind w:left="1440" w:hanging="360"/>
+      </w:pPr>
+      <w:rPr>
+        <w:rFonts w:ascii="Courier New" w:hAnsi="Courier New" w:hint="default"/>
+        <w:sz w:val="20"/>
+      </w:rPr>
+    </w:lvl>
+    <w:lvl w:ilvl="2" w:tentative="1">
+      <w:start w:val="1"/>
+      <w:numFmt w:val="bullet"/>
+      <w:lvlText w:val=""/>
+      <w:lvlJc w:val="left"/>
+      <w:pPr>
+        <w:tabs>
+          <w:tab w:val="num" w:pos="2160"/>
+        </w:tabs>
+        <w:ind w:left="2160" w:hanging="360"/>
+      </w:pPr>
+      <w:rPr>
+        <w:rFonts w:ascii="Wingdings" w:hAnsi="Wingdings" w:hint="default"/>
+        <w:sz w:val="20"/>
+      </w:rPr>
+    </w:lvl>
+    <w:lvl w:ilvl="3" w:tentative="1">
+      <w:start w:val="1"/>
+      <w:numFmt w:val="bullet"/>
+      <w:lvlText w:val=""/>
+      <w:lvlJc w:val="left"/>
+      <w:pPr>
+        <w:tabs>
+          <w:tab w:val="num" w:pos="2880"/>
+        </w:tabs>
+        <w:ind w:left="2880" w:hanging="360"/>
+      </w:pPr>
+      <w:rPr>
+        <w:rFonts w:ascii="Wingdings" w:hAnsi="Wingdings" w:hint="default"/>
+        <w:sz w:val="20"/>
+      </w:rPr>
+    </w:lvl>
+    <w:lvl w:ilvl="4" w:tentative="1">
+      <w:start w:val="1"/>
+      <w:numFmt w:val="bullet"/>
+      <w:lvlText w:val=""/>
+      <w:lvlJc w:val="left"/>
+      <w:pPr>
+        <w:tabs>
+          <w:tab w:val="num" w:pos="3600"/>
+        </w:tabs>
+        <w:ind w:left="3600" w:hanging="360"/>
+      </w:pPr>
+      <w:rPr>
+        <w:rFonts w:ascii="Wingdings" w:hAnsi="Wingdings" w:hint="default"/>
+        <w:sz w:val="20"/>
+      </w:rPr>
+    </w:lvl>
+    <w:lvl w:ilvl="5" w:tentative="1">
+      <w:start w:val="1"/>
+      <w:numFmt w:val="bullet"/>
+      <w:lvlText w:val=""/>
+      <w:lvlJc w:val="left"/>
+      <w:pPr>
+        <w:tabs>
+          <w:tab w:val="num" w:pos="4320"/>
+        </w:tabs>
+        <w:ind w:left="4320" w:hanging="360"/>
+      </w:pPr>
+      <w:rPr>
+        <w:rFonts w:ascii="Wingdings" w:hAnsi="Wingdings" w:hint="default"/>
+        <w:sz w:val="20"/>
+      </w:rPr>
+    </w:lvl>
+    <w:lvl w:ilvl="6" w:tentative="1">
+      <w:start w:val="1"/>
+      <w:numFmt w:val="bullet"/>
+      <w:lvlText w:val=""/>
+      <w:lvlJc w:val="left"/>
+      <w:pPr>
+        <w:tabs>
+          <w:tab w:val="num" w:pos="5040"/>
+        </w:tabs>
+        <w:ind w:left="5040" w:hanging="360"/>
+      </w:pPr>
+      <w:rPr>
+        <w:rFonts w:ascii="Wingdings" w:hAnsi="Wingdings" w:hint="default"/>
+        <w:sz w:val="20"/>
+      </w:rPr>
+    </w:lvl>
+    <w:lvl w:ilvl="7" w:tentative="1">
+      <w:start w:val="1"/>
+      <w:numFmt w:val="bullet"/>
+      <w:lvlText w:val=""/>
+      <w:lvlJc w:val="left"/>
+      <w:pPr>
+        <w:tabs>
+          <w:tab w:val="num" w:pos="5760"/>
+        </w:tabs>
+        <w:ind w:left="5760" w:hanging="360"/>
+      </w:pPr>
+      <w:rPr>
+        <w:rFonts w:ascii="Wingdings" w:hAnsi="Wingdings" w:hint="default"/>
+        <w:sz w:val="20"/>
+      </w:rPr>
+    </w:lvl>
+    <w:lvl w:ilvl="8" w:tentative="1">
+      <w:start w:val="1"/>
+      <w:numFmt w:val="bullet"/>
+      <w:lvlText w:val=""/>
+      <w:lvlJc w:val="left"/>
+      <w:pPr>
+        <w:tabs>
+          <w:tab w:val="num" w:pos="6480"/>
+        </w:tabs>
+        <w:ind w:left="6480" w:hanging="360"/>
+      </w:pPr>
+      <w:rPr>
+        <w:rFonts w:ascii="Wingdings" w:hAnsi="Wingdings" w:hint="default"/>
+        <w:sz w:val="20"/>
+      </w:rPr>
+    </w:lvl>
+  </w:abstractNum>
+  <w:abstractNum w:abstractNumId="1" w15:restartNumberingAfterBreak="0">
+    <w:nsid w:val="42F03433"/>
+    <w:multiLevelType w:val="multilevel"/>
+    <w:tmpl w:val="68CAA724"/>
+    <w:lvl w:ilvl="0">
+      <w:start w:val="1"/>
+      <w:numFmt w:val="bullet"/>
+      <w:lvlText w:val=""/>
+      <w:lvlJc w:val="left"/>
+      <w:pPr>
+        <w:tabs>
+          <w:tab w:val="num" w:pos="720"/>
+        </w:tabs>
+        <w:ind w:left="720" w:hanging="360"/>
+      </w:pPr>
+      <w:rPr>
+        <w:rFonts w:ascii="Symbol" w:hAnsi="Symbol" w:hint="default"/>
+        <w:sz w:val="20"/>
+      </w:rPr>
+    </w:lvl>
+    <w:lvl w:ilvl="1" w:tentative="1">
+      <w:start w:val="1"/>
+      <w:numFmt w:val="bullet"/>
+      <w:lvlText w:val="o"/>
+      <w:lvlJc w:val="left"/>
+      <w:pPr>
+        <w:tabs>
+          <w:tab w:val="num" w:pos="1440"/>
+        </w:tabs>
+        <w:ind w:left="1440" w:hanging="360"/>
+      </w:pPr>
+      <w:rPr>
+        <w:rFonts w:ascii="Courier New" w:hAnsi="Courier New" w:hint="default"/>
+        <w:sz w:val="20"/>
+      </w:rPr>
+    </w:lvl>
+    <w:lvl w:ilvl="2" w:tentative="1">
+      <w:start w:val="1"/>
+      <w:numFmt w:val="bullet"/>
+      <w:lvlText w:val=""/>
+      <w:lvlJc w:val="left"/>
+      <w:pPr>
+        <w:tabs>
+          <w:tab w:val="num" w:pos="2160"/>
+        </w:tabs>
+        <w:ind w:left="2160" w:hanging="360"/>
+      </w:pPr>
+      <w:rPr>
+        <w:rFonts w:ascii="Wingdings" w:hAnsi="Wingdings" w:hint="default"/>
+        <w:sz w:val="20"/>
+      </w:rPr>
+    </w:lvl>
+    <w:lvl w:ilvl="3" w:tentative="1">
+      <w:start w:val="1"/>
+      <w:numFmt w:val="bullet"/>
+      <w:lvlText w:val=""/>
+      <w:lvlJc w:val="left"/>
+      <w:pPr>
+        <w:tabs>
+          <w:tab w:val="num" w:pos="2880"/>
+        </w:tabs>
+        <w:ind w:left="2880" w:hanging="360"/>
+      </w:pPr>
+      <w:rPr>
+        <w:rFonts w:ascii="Wingdings" w:hAnsi="Wingdings" w:hint="default"/>
+        <w:sz w:val="20"/>
+      </w:rPr>
+    </w:lvl>
+    <w:lvl w:ilvl="4" w:tentative="1">
+      <w:start w:val="1"/>
+      <w:numFmt w:val="bullet"/>
+      <w:lvlText w:val=""/>
+      <w:lvlJc w:val="left"/>
+      <w:pPr>
+        <w:tabs>
+          <w:tab w:val="num" w:pos="3600"/>
+        </w:tabs>
+        <w:ind w:left="3600" w:hanging="360"/>
+      </w:pPr>
+      <w:rPr>
+        <w:rFonts w:ascii="Wingdings" w:hAnsi="Wingdings" w:hint="default"/>
+        <w:sz w:val="20"/>
+      </w:rPr>
+    </w:lvl>
+    <w:lvl w:ilvl="5" w:tentative="1">
+      <w:start w:val="1"/>
+      <w:numFmt w:val="bullet"/>
+      <w:lvlText w:val=""/>
+      <w:lvlJc w:val="left"/>
+      <w:pPr>
+        <w:tabs>
+          <w:tab w:val="num" w:pos="4320"/>
+        </w:tabs>
+        <w:ind w:left="4320" w:hanging="360"/>
+      </w:pPr>
+      <w:rPr>
+        <w:rFonts w:ascii="Wingdings" w:hAnsi="Wingdings" w:hint="default"/>
+        <w:sz w:val="20"/>
+      </w:rPr>
+    </w:lvl>
+    <w:lvl w:ilvl="6" w:tentative="1">
+      <w:start w:val="1"/>
+      <w:numFmt w:val="bullet"/>
+      <w:lvlText w:val=""/>
+      <w:lvlJc w:val="left"/>
+      <w:pPr>
+        <w:tabs>
+          <w:tab w:val="num" w:pos="5040"/>
+        </w:tabs>
+        <w:ind w:left="5040" w:hanging="360"/>
+      </w:pPr>
+      <w:rPr>
+        <w:rFonts w:ascii="Wingdings" w:hAnsi="Wingdings" w:hint="default"/>
+        <w:sz w:val="20"/>
+      </w:rPr>
+    </w:lvl>
+    <w:lvl w:ilvl="7" w:tentative="1">
+      <w:start w:val="1"/>
+      <w:numFmt w:val="bullet"/>
+      <w:lvlText w:val=""/>
+      <w:lvlJc w:val="left"/>
+      <w:pPr>
+        <w:tabs>
+          <w:tab w:val="num" w:pos="5760"/>
+        </w:tabs>
+        <w:ind w:left="5760" w:hanging="360"/>
+      </w:pPr>
+      <w:rPr>
+        <w:rFonts w:ascii="Wingdings" w:hAnsi="Wingdings" w:hint="default"/>
+        <w:sz w:val="20"/>
+      </w:rPr>
+    </w:lvl>
+    <w:lvl w:ilvl="8" w:tentative="1">
+      <w:start w:val="1"/>
+      <w:numFmt w:val="bullet"/>
+      <w:lvlText w:val=""/>
+      <w:lvlJc w:val="left"/>
+      <w:pPr>
+        <w:tabs>
+          <w:tab w:val="num" w:pos="6480"/>
+        </w:tabs>
+        <w:ind w:left="6480" w:hanging="360"/>
+      </w:pPr>
+      <w:rPr>
+        <w:rFonts w:ascii="Wingdings" w:hAnsi="Wingdings" w:hint="default"/>
+        <w:sz w:val="20"/>
+      </w:rPr>
+    </w:lvl>
+  </w:abstractNum>
+  <w:abstractNum w:abstractNumId="2" w15:restartNumberingAfterBreak="0">
+    <w:nsid w:val="44925371"/>
+    <w:multiLevelType w:val="multilevel"/>
+    <w:tmpl w:val="B34C02FA"/>
+    <w:lvl w:ilvl="0">
+      <w:start w:val="1"/>
+      <w:numFmt w:val="decimal"/>
+      <w:lvlText w:val="%1."/>
+      <w:lvlJc w:val="left"/>
+      <w:pPr>
+        <w:tabs>
+          <w:tab w:val="num" w:pos="720"/>
+        </w:tabs>
+        <w:ind w:left="720" w:hanging="360"/>
+      </w:pPr>
+    </w:lvl>
+    <w:lvl w:ilvl="1" w:tentative="1">
+      <w:start w:val="1"/>
+      <w:numFmt w:val="decimal"/>
+      <w:lvlText w:val="%2."/>
+      <w:lvlJc w:val="left"/>
+      <w:pPr>
+        <w:tabs>
+          <w:tab w:val="num" w:pos="1440"/>
+        </w:tabs>
+        <w:ind w:left="1440" w:hanging="360"/>
+      </w:pPr>
+    </w:lvl>
+    <w:lvl w:ilvl="2" w:tentative="1">
+      <w:start w:val="1"/>
+      <w:numFmt w:val="decimal"/>
+      <w:lvlText w:val="%3."/>
+      <w:lvlJc w:val="left"/>
+      <w:pPr>
+        <w:tabs>
+          <w:tab w:val="num" w:pos="2160"/>
+        </w:tabs>
+        <w:ind w:left="2160" w:hanging="360"/>
+      </w:pPr>
+    </w:lvl>
+    <w:lvl w:ilvl="3" w:tentative="1">
+      <w:start w:val="1"/>
+      <w:numFmt w:val="decimal"/>
+      <w:lvlText w:val="%4."/>
+      <w:lvlJc w:val="left"/>
+      <w:pPr>
+        <w:tabs>
+          <w:tab w:val="num" w:pos="2880"/>
+        </w:tabs>
+        <w:ind w:left="2880" w:hanging="360"/>
+      </w:pPr>
+    </w:lvl>
+    <w:lvl w:ilvl="4" w:tentative="1">
+      <w:start w:val="1"/>
+      <w:numFmt w:val="decimal"/>
+      <w:lvlText w:val="%5."/>
+      <w:lvlJc w:val="left"/>
+      <w:pPr>
+        <w:tabs>
+          <w:tab w:val="num" w:pos="3600"/>
+        </w:tabs>
+        <w:ind w:left="3600" w:hanging="360"/>
+      </w:pPr>
+    </w:lvl>
+    <w:lvl w:ilvl="5" w:tentative="1">
+      <w:start w:val="1"/>
+      <w:numFmt w:val="decimal"/>
+      <w:lvlText w:val="%6."/>
+      <w:lvlJc w:val="left"/>
+      <w:pPr>
+        <w:tabs>
+          <w:tab w:val="num" w:pos="4320"/>
+        </w:tabs>
+        <w:ind w:left="4320" w:hanging="360"/>
+      </w:pPr>
+    </w:lvl>
+    <w:lvl w:ilvl="6" w:tentative="1">
+      <w:start w:val="1"/>
+      <w:numFmt w:val="decimal"/>
+      <w:lvlText w:val="%7."/>
+      <w:lvlJc w:val="left"/>
+      <w:pPr>
+        <w:tabs>
+          <w:tab w:val="num" w:pos="5040"/>
+        </w:tabs>
+        <w:ind w:left="5040" w:hanging="360"/>
+      </w:pPr>
+    </w:lvl>
+    <w:lvl w:ilvl="7" w:tentative="1">
+      <w:start w:val="1"/>
+      <w:numFmt w:val="decimal"/>
+      <w:lvlText w:val="%8."/>
+      <w:lvlJc w:val="left"/>
+      <w:pPr>
+        <w:tabs>
+          <w:tab w:val="num" w:pos="5760"/>
+        </w:tabs>
+        <w:ind w:left="5760" w:hanging="360"/>
+      </w:pPr>
+    </w:lvl>
+    <w:lvl w:ilvl="8" w:tentative="1">
+      <w:start w:val="1"/>
+      <w:numFmt w:val="decimal"/>
+      <w:lvlText w:val="%9."/>
+      <w:lvlJc w:val="left"/>
+      <w:pPr>
+        <w:tabs>
+          <w:tab w:val="num" w:pos="6480"/>
+        </w:tabs>
+        <w:ind w:left="6480" w:hanging="360"/>
+      </w:pPr>
+    </w:lvl>
+  </w:abstractNum>
+  <w:abstractNum w:abstractNumId="3" w15:restartNumberingAfterBreak="0">
     <w:nsid w:val="4A9E531C"/>
     <w:multiLevelType w:val="multilevel"/>
     <w:tmpl w:val="4390556A"/>
@@ -573,8 +1613,133 @@
       </w:pPr>
     </w:lvl>
   </w:abstractNum>
+  <w:abstractNum w:abstractNumId="4" w15:restartNumberingAfterBreak="0">
+    <w:nsid w:val="59CC3C86"/>
+    <w:multiLevelType w:val="multilevel"/>
+    <w:tmpl w:val="494EC5A0"/>
+    <w:lvl w:ilvl="0">
+      <w:start w:val="1"/>
+      <w:numFmt w:val="decimal"/>
+      <w:lvlText w:val="%1."/>
+      <w:lvlJc w:val="left"/>
+      <w:pPr>
+        <w:tabs>
+          <w:tab w:val="num" w:pos="720"/>
+        </w:tabs>
+        <w:ind w:left="720" w:hanging="360"/>
+      </w:pPr>
+    </w:lvl>
+    <w:lvl w:ilvl="1" w:tentative="1">
+      <w:start w:val="1"/>
+      <w:numFmt w:val="decimal"/>
+      <w:lvlText w:val="%2."/>
+      <w:lvlJc w:val="left"/>
+      <w:pPr>
+        <w:tabs>
+          <w:tab w:val="num" w:pos="1440"/>
+        </w:tabs>
+        <w:ind w:left="1440" w:hanging="360"/>
+      </w:pPr>
+    </w:lvl>
+    <w:lvl w:ilvl="2" w:tentative="1">
+      <w:start w:val="1"/>
+      <w:numFmt w:val="decimal"/>
+      <w:lvlText w:val="%3."/>
+      <w:lvlJc w:val="left"/>
+      <w:pPr>
+        <w:tabs>
+          <w:tab w:val="num" w:pos="2160"/>
+        </w:tabs>
+        <w:ind w:left="2160" w:hanging="360"/>
+      </w:pPr>
+    </w:lvl>
+    <w:lvl w:ilvl="3" w:tentative="1">
+      <w:start w:val="1"/>
+      <w:numFmt w:val="decimal"/>
+      <w:lvlText w:val="%4."/>
+      <w:lvlJc w:val="left"/>
+      <w:pPr>
+        <w:tabs>
+          <w:tab w:val="num" w:pos="2880"/>
+        </w:tabs>
+        <w:ind w:left="2880" w:hanging="360"/>
+      </w:pPr>
+    </w:lvl>
+    <w:lvl w:ilvl="4" w:tentative="1">
+      <w:start w:val="1"/>
+      <w:numFmt w:val="decimal"/>
+      <w:lvlText w:val="%5."/>
+      <w:lvlJc w:val="left"/>
+      <w:pPr>
+        <w:tabs>
+          <w:tab w:val="num" w:pos="3600"/>
+        </w:tabs>
+        <w:ind w:left="3600" w:hanging="360"/>
+      </w:pPr>
+    </w:lvl>
+    <w:lvl w:ilvl="5" w:tentative="1">
+      <w:start w:val="1"/>
+      <w:numFmt w:val="decimal"/>
+      <w:lvlText w:val="%6."/>
+      <w:lvlJc w:val="left"/>
+      <w:pPr>
+        <w:tabs>
+          <w:tab w:val="num" w:pos="4320"/>
+        </w:tabs>
+        <w:ind w:left="4320" w:hanging="360"/>
+      </w:pPr>
+    </w:lvl>
+    <w:lvl w:ilvl="6" w:tentative="1">
+      <w:start w:val="1"/>
+      <w:numFmt w:val="decimal"/>
+      <w:lvlText w:val="%7."/>
+      <w:lvlJc w:val="left"/>
+      <w:pPr>
+        <w:tabs>
+          <w:tab w:val="num" w:pos="5040"/>
+        </w:tabs>
+        <w:ind w:left="5040" w:hanging="360"/>
+      </w:pPr>
+    </w:lvl>
+    <w:lvl w:ilvl="7" w:tentative="1">
+      <w:start w:val="1"/>
+      <w:numFmt w:val="decimal"/>
+      <w:lvlText w:val="%8."/>
+      <w:lvlJc w:val="left"/>
+      <w:pPr>
+        <w:tabs>
+          <w:tab w:val="num" w:pos="5760"/>
+        </w:tabs>
+        <w:ind w:left="5760" w:hanging="360"/>
+      </w:pPr>
+    </w:lvl>
+    <w:lvl w:ilvl="8" w:tentative="1">
+      <w:start w:val="1"/>
+      <w:numFmt w:val="decimal"/>
+      <w:lvlText w:val="%9."/>
+      <w:lvlJc w:val="left"/>
+      <w:pPr>
+        <w:tabs>
+          <w:tab w:val="num" w:pos="6480"/>
+        </w:tabs>
+        <w:ind w:left="6480" w:hanging="360"/>
+      </w:pPr>
+    </w:lvl>
+  </w:abstractNum>
   <w:num w:numId="1" w16cid:durableId="451365129">
+    <w:abstractNumId w:val="3"/>
+  </w:num>
+  <w:num w:numId="2" w16cid:durableId="907228081">
     <w:abstractNumId w:val="0"/>
+  </w:num>
+  <w:num w:numId="3" w16cid:durableId="1472090632">
+    <w:abstractNumId w:val="2"/>
+  </w:num>
+  <w:num w:numId="4" w16cid:durableId="1528985823">
+    <w:abstractNumId w:val="1"/>
+  </w:num>
+  <w:num w:numId="5" w16cid:durableId="234096763">
+    <w:abstractNumId w:val="4"/>
   </w:num>
 </w:numbering>
 </file>
@@ -1182,7 +2347,6 @@
   <w:style w:type="character" w:default="1" w:styleId="Fontepargpadro">
     <w:name w:val="Default Paragraph Font"/>
     <w:uiPriority w:val="1"/>
-    <w:semiHidden/>
     <w:unhideWhenUsed/>
   </w:style>
   <w:style w:type="table" w:default="1" w:styleId="Tabelanormal">

</xml_diff>